<commit_message>
Finalize round 28 ZIP startup evidence and Windows prerequisite validation
</commit_message>
<xml_diff>
--- a/docs/twenty-eighth-round-delivery-report.docx
+++ b/docs/twenty-eighth-round-delivery-report.docx
@@ -540,7 +540,7 @@
     </w:p>
     <w:p>
       <w:r>
-        <w:t>实现提交：390b4626e7d32a24c5fb4b8726287caafd79acfd。保护范围：apps/api/src、apps/web/src、experiment-core、AI Orchestrator／Validator、Model Adapter、contracts／database、research配置、数据库迁移、依赖与锁无修改。变化仅在本地封装、原 Preview启动兼容、审核名称、离线提取器、回归和文档。源ZIP不含 .git时使用更新的 build metadata 记录该实现提交。</w:t>
+        <w:t>实现提交：c9686a641d37d605032292d4ee5552a1f7e638fa。保护范围：apps/api/src、apps/web/src、experiment-core、AI Orchestrator／Validator、Model Adapter、contracts／database、research配置、数据库迁移、依赖与锁无修改。变化仅在本地封装、原 Preview启动兼容、审核名称、离线提取器、回归和文档。源ZIP不含 .git时使用更新的 build metadata 记录该实现提交。</w:t>
       </w:r>
     </w:p>
     <w:p>
@@ -1010,6 +1010,11 @@
         <w:t>云环境启动指引已更新草稿，说明本地优先、自动端口和保护历史；安装脚本、网络和Secret绑定不变。保存不代表发布，如需后续任务采用，环境设置审核、保存并发布。此配置审核不阻止当前下载或自己的电脑启动。</w:t>
       </w:r>
     </w:p>
+    <w:p>
+      <w:r>
+        <w:t>源码 ZIP 在不含 .git、目录名含空格的独立临时目录实际 npm ci、PowerShell构建／启动／初始化并验证 HTML／health通过。最终PS前置检查和build metadata也已复验，未调用模型。证据见 source-zip-startup.json；该验证仍为 Linux PowerShell Core，不是 Windows真机。验证临时数据库已清理，不影响原体验历史。</w:t>
+      </w:r>
+    </w:p>
     <w:sectPr>
       <w:headerReference w:type="default" r:id="rId9"/>
       <w:footerReference w:type="default" r:id="rId10"/>

</xml_diff>